<commit_message>
Defenicion del proyecto y diagramas actualizados
</commit_message>
<xml_diff>
--- a/Definicion del proyecto intermodular Georgii.docx
+++ b/Definicion del proyecto intermodular Georgii.docx
@@ -60,11 +60,6 @@
     </w:p>
     <w:p>
       <w:r>
-        <w:t>Administrador – Que va a tener datos de las cuentas</w:t>
-      </w:r>
-    </w:p>
-    <w:p>
-      <w:r>
         <w:t xml:space="preserve">Usuarios normales – Van a tener sus datos locales, pero también pueden tener acceso limitado o ilimitado a datos locales del otro usuario (Padre </w:t>
       </w:r>
       <w:r>
@@ -83,6 +78,44 @@
       <w:proofErr w:type="spellEnd"/>
       <w:r>
         <w:t xml:space="preserve"> leader – empleado).</w:t>
+      </w:r>
+    </w:p>
+    <w:p>
+      <w:proofErr w:type="spellStart"/>
+      <w:r>
+        <w:t>Sub</w:t>
+      </w:r>
+      <w:r>
+        <w:t>Usuario</w:t>
+      </w:r>
+      <w:proofErr w:type="spellEnd"/>
+      <w:r>
+        <w:t>(Local, External</w:t>
+      </w:r>
+      <w:bookmarkStart w:id="0" w:name="_GoBack"/>
+      <w:bookmarkEnd w:id="0"/>
+      <w:r>
+        <w:t>)</w:t>
+      </w:r>
+      <w:r>
+        <w:t xml:space="preserve"> – Van a tener sus datos locales</w:t>
+      </w:r>
+      <w:r>
+        <w:t xml:space="preserve"> que forman parte de usuario normal. Esos datos serán los datos que quiere compartir el usuario</w:t>
+      </w:r>
+      <w:r>
+        <w:t xml:space="preserve"> o cuales fueron compartidos con usuario</w:t>
+      </w:r>
+      <w:r>
+        <w:t>.</w:t>
+      </w:r>
+    </w:p>
+    <w:p>
+      <w:r>
+        <w:t>Usuario externo</w:t>
+      </w:r>
+      <w:r>
+        <w:t xml:space="preserve"> – Son usuarios externos que quieren acceder a los datos compartidos</w:t>
       </w:r>
     </w:p>
     <w:p>
@@ -105,10 +138,13 @@
     </w:p>
     <w:p>
       <w:r>
-        <w:t>Crear actividades fijas (trabajar 8:00-16:00) y no fijas (leer libro 2 horas) con sus propios datos (lugar, hora, tiempo, en qué periodo de tiempo, en qué condiciones, material necesario, modo actuación de la app y etc.).</w:t>
-      </w:r>
-    </w:p>
-    <w:p>
+        <w:t>Crear actividades fijas (trabajar 8:00-16:00) y no fijas (leer libro 2 horas) con sus propios datos (lugar, hora, tiempo, en qué periodo de tiempo, en qué condiciones, modo actuación de la app y etc.).</w:t>
+      </w:r>
+    </w:p>
+    <w:p>
+      <w:r>
+        <w:t>(</w:t>
+      </w:r>
       <w:r>
         <w:t>Crear actividades a través de los calendarios o horarios usando IA.</w:t>
       </w:r>
@@ -126,10 +162,13 @@
       <w:r>
         <w:t xml:space="preserve"> o/y IA.</w:t>
       </w:r>
-    </w:p>
-    <w:p>
-      <w:r>
-        <w:t>Hacer que el horario tenia en cuenta los datos de actividades (app recuerda que cosa hay que llevar, añadir el tiempo del camino si las actividades están en diferentes lugares)</w:t>
+      <w:r>
+        <w:t>) Lo hago en caso si voy a tener tiempo</w:t>
+      </w:r>
+    </w:p>
+    <w:p>
+      <w:r>
+        <w:t>Hacer que el horario tenia en cuenta los datos de actividades (añadir el tiempo del camino si las actividades están en diferentes lugares)</w:t>
       </w:r>
     </w:p>
     <w:p>
@@ -137,10 +176,8 @@
         <w:t xml:space="preserve">En caso si el usuario añade nuevo dispositivo mandar los datos utilizando </w:t>
       </w:r>
       <w:r>
-        <w:t>TCP</w:t>
-      </w:r>
-      <w:bookmarkStart w:id="0" w:name="_GoBack"/>
-      <w:bookmarkEnd w:id="0"/>
+        <w:t>UDP</w:t>
+      </w:r>
       <w:r>
         <w:t>.</w:t>
       </w:r>
@@ -204,6 +241,7 @@
     </w:p>
     <w:p>
       <w:r>
+        <w:lastRenderedPageBreak/>
         <w:t>GitHub</w:t>
       </w:r>
       <w:r>

</xml_diff>